<commit_message>
Enabled cost calculations based on distance
</commit_message>
<xml_diff>
--- a/docs/articles/tRee2MillCost_vignette.docx
+++ b/docs/articles/tRee2MillCost_vignette.docx
@@ -23,7 +23,7 @@
         <w:pStyle w:val="Date"/>
       </w:pPr>
       <w:r>
-        <w:t>2026-09-09</w:t>
+        <w:t>2026-09-10</w:t>
       </w:r>
     </w:p>
     <w:p>
@@ -99,7 +99,7 @@
         <w:pStyle w:val="BodyText"/>
       </w:pPr>
       <w:r>
-        <w:t>Cost estimates based on travel distance require no road attributes, the linear representation suffices. For cost estimates based on travel time all segments in the composite vector network ingested to produce the raster representation must have an attribute representing the modeled travel speed along that segment—for example, the expected speed of log trucks. Legal speed limits are one way to represent travel speed, but rarely included in publicly available vector road layers. Users therefore must estimate travel speeds from auxiliary information, and appropriate values for a given road class may vary geographically. The vector road layer must be attributed with travel speed values before running package functions. Raster cells containing more than one road segment, or part of a segment, inherit the highest travel speed value among them.</w:t>
+        <w:t>A composite vector network ingested to produce the raster representation does not require road attributes to produce cost estimates based on travel distance. For cost estimates based on travel time, all segments in the composite vector network must have an attribute representing the modeled travel speed along that segment—for example, the expected speed of log trucks. Legal speed limits are one way to represent travel speed, but rarely included in publicly available vector road layers. Users therefore must estimate travel speeds from auxiliary information, and appropriate values for a given road class may vary geographically. The vector road layer must be attributed with travel speed values before running package functions. Raster cells containing more than one road segment, or part of a segment, inherit the highest travel speed value among them.</w:t>
       </w:r>
     </w:p>
     <w:p>
@@ -2928,7 +2928,7 @@
         </w:rPr>
         <w:lastRenderedPageBreak/>
         <w:drawing>
-          <wp:inline distT="0" distB="0" distL="0" distR="0" wp14:anchorId="1E341A14" wp14:editId="4FD929E9">
+          <wp:inline distT="0" distB="0" distL="0" distR="0" wp14:anchorId="393BD87C" wp14:editId="47ECD906">
             <wp:extent cx="4800600" cy="4800600"/>
             <wp:effectExtent l="0" t="0" r="0" b="0"/>
             <wp:docPr id="25" name="Picture"/>
@@ -2937,7 +2937,7 @@
               <a:graphicData uri="http://schemas.openxmlformats.org/drawingml/2006/picture">
                 <pic:pic xmlns:pic="http://schemas.openxmlformats.org/drawingml/2006/picture">
                   <pic:nvPicPr>
-                    <pic:cNvPr id="26" name="Picture" descr="C:/Users/dgatziolis/AppData/Local/Temp/RtmpiS2AoW/preview-419824ee3a8a.dir/tRee2MillCost_vignette_files/figure-docx/iso-1.png"/>
+                    <pic:cNvPr id="26" name="Picture" descr="C:/Users/dgatziolis/AppData/Local/Temp/RtmpgLxL37/preview-994034da3df8.dir/tRee2MillCost_vignette_files/figure-docx/iso-1.png"/>
                     <pic:cNvPicPr>
                       <a:picLocks noChangeAspect="1" noChangeArrowheads="1"/>
                     </pic:cNvPicPr>
@@ -4002,7 +4002,7 @@
         </w:rPr>
         <w:lastRenderedPageBreak/>
         <w:drawing>
-          <wp:inline distT="0" distB="0" distL="0" distR="0" wp14:anchorId="5929B5C5" wp14:editId="302F3683">
+          <wp:inline distT="0" distB="0" distL="0" distR="0" wp14:anchorId="644E9C0F" wp14:editId="36C5E655">
             <wp:extent cx="4800600" cy="4800600"/>
             <wp:effectExtent l="0" t="0" r="0" b="0"/>
             <wp:docPr id="28" name="Picture"/>
@@ -4011,7 +4011,7 @@
               <a:graphicData uri="http://schemas.openxmlformats.org/drawingml/2006/picture">
                 <pic:pic xmlns:pic="http://schemas.openxmlformats.org/drawingml/2006/picture">
                   <pic:nvPicPr>
-                    <pic:cNvPr id="29" name="Picture" descr="C:/Users/dgatziolis/AppData/Local/Temp/RtmpiS2AoW/preview-419824ee3a8a.dir/tRee2MillCost_vignette_files/figure-docx/paths-1.png"/>
+                    <pic:cNvPr id="29" name="Picture" descr="C:/Users/dgatziolis/AppData/Local/Temp/RtmpgLxL37/preview-994034da3df8.dir/tRee2MillCost_vignette_files/figure-docx/paths-1.png"/>
                     <pic:cNvPicPr>
                       <a:picLocks noChangeAspect="1" noChangeArrowheads="1"/>
                     </pic:cNvPicPr>
@@ -4062,7 +4062,7 @@
   <w:abstractNum w:abstractNumId="0" w15:restartNumberingAfterBreak="0">
     <w:nsid w:val="0000A990"/>
     <w:multiLevelType w:val="multilevel"/>
-    <w:tmpl w:val="401AB4C0"/>
+    <w:tmpl w:val="4B881FD0"/>
     <w:lvl w:ilvl="0">
       <w:numFmt w:val="bullet"/>
       <w:lvlText w:val=" "/>
@@ -4139,7 +4139,7 @@
   <w:abstractNum w:abstractNumId="1" w15:restartNumberingAfterBreak="0">
     <w:nsid w:val="0000A991"/>
     <w:multiLevelType w:val="multilevel"/>
-    <w:tmpl w:val="22244BCE"/>
+    <w:tmpl w:val="09185554"/>
     <w:lvl w:ilvl="0">
       <w:numFmt w:val="bullet"/>
       <w:lvlText w:val=""/>
@@ -4240,13 +4240,13 @@
       </w:rPr>
     </w:lvl>
   </w:abstractNum>
-  <w:num w:numId="1" w16cid:durableId="1783181009">
+  <w:num w:numId="1" w16cid:durableId="1657150965">
     <w:abstractNumId w:val="0"/>
   </w:num>
-  <w:num w:numId="2" w16cid:durableId="783622813">
+  <w:num w:numId="2" w16cid:durableId="1904633040">
     <w:abstractNumId w:val="1"/>
   </w:num>
-  <w:num w:numId="3" w16cid:durableId="1104806985">
+  <w:num w:numId="3" w16cid:durableId="1212765576">
     <w:abstractNumId w:val="1"/>
   </w:num>
 </w:numbering>

</xml_diff>